<commit_message>
Bring the docs back in line with the site
Documentation had drifted behind two days of changes. Updated:
- data_dictionary: name_marker and trajectory_class with their derivation rules
  and counts; a Language section explaining that Spanish is the stored value and
  English is a display annotation
- README: the two-cube architecture and why; no-top-N-caps note; the full filter
  list; the basemap build step; serve.py instead of http.server, with the reason
- social post: trajectory Unknown share corrected 94.8 percent to 91.2 percent
  after the combined classification, in both the long and short variants

Co-Authored-By: Claude Opus 5 <noreply@anthropic.com>
</commit_message>
<xml_diff>
--- a/docs/word/data_dictionary.docx
+++ b/docs/word/data_dictionary.docx
@@ -28,7 +28,7 @@
         </w:p>
       </w:sdtContent>
     </w:sdt>
-    <w:bookmarkStart w:id="16" w:name="data-dictionary"/>
+    <w:bookmarkStart w:id="17" w:name="data-dictionary"/>
     <w:p>
       <w:pPr>
         <w:pStyle w:val="Heading1"/>
@@ -2266,43 +2266,7 @@
               <w:pStyle w:val="Compact"/>
             </w:pPr>
             <w:r>
-              <w:t xml:space="preserve">no fracture record →</w:t>
-            </w:r>
-            <w:r>
-              <w:t xml:space="preserve"> </w:t>
-            </w:r>
-            <w:r>
-              <w:rPr>
-                <w:rStyle w:val="VerbatimChar"/>
-              </w:rPr>
-              <w:t xml:space="preserve">Unknown</w:t>
-            </w:r>
-            <w:r>
-              <w:t xml:space="preserve">; lateral ≥ 500 m →</w:t>
-            </w:r>
-            <w:r>
-              <w:t xml:space="preserve"> </w:t>
-            </w:r>
-            <w:r>
-              <w:rPr>
-                <w:rStyle w:val="VerbatimChar"/>
-              </w:rPr>
-              <w:t xml:space="preserve">Horizontal</w:t>
-            </w:r>
-            <w:r>
-              <w:t xml:space="preserve">; else</w:t>
-            </w:r>
-            <w:r>
-              <w:t xml:space="preserve"> </w:t>
-            </w:r>
-            <w:r>
-              <w:rPr>
-                <w:rStyle w:val="VerbatimChar"/>
-              </w:rPr>
-              <w:t xml:space="preserve">Vertical</w:t>
-            </w:r>
-            <w:r>
-              <w:t xml:space="preserve">. The 500 m cut sits inside an almost empty corridor in the distribution — only 20 of 4,604 wells fall between 150 m and 600 m — so the classification is insensitive to it.</w:t>
+              <w:t xml:space="preserve">The</w:t>
             </w:r>
             <w:r>
               <w:t xml:space="preserve"> </w:t>
@@ -2312,23 +2276,46 @@
                 <w:b/>
                 <w:bCs/>
               </w:rPr>
-              <w:t xml:space="preserve">Never imputed for wells without a record.</w:t>
-            </w:r>
-          </w:p>
-        </w:tc>
-      </w:tr>
-      <w:tr>
-        <w:tc>
-          <w:tcPr/>
-          <w:p>
-            <w:pPr>
-              <w:pStyle w:val="Compact"/>
-            </w:pPr>
-            <w:r>
-              <w:rPr>
-                <w:rStyle w:val="VerbatimChar"/>
-              </w:rPr>
-              <w:t xml:space="preserve">lateral_m</w:t>
+              <w:t xml:space="preserve">measurement only</w:t>
+            </w:r>
+            <w:r>
+              <w:t xml:space="preserve">. No fracture record →</w:t>
+            </w:r>
+            <w:r>
+              <w:t xml:space="preserve"> </w:t>
+            </w:r>
+            <w:r>
+              <w:rPr>
+                <w:rStyle w:val="VerbatimChar"/>
+              </w:rPr>
+              <w:t xml:space="preserve">Unknown</w:t>
+            </w:r>
+            <w:r>
+              <w:t xml:space="preserve">; lateral ≥ 500 m →</w:t>
+            </w:r>
+            <w:r>
+              <w:t xml:space="preserve"> </w:t>
+            </w:r>
+            <w:r>
+              <w:rPr>
+                <w:rStyle w:val="VerbatimChar"/>
+              </w:rPr>
+              <w:t xml:space="preserve">Horizontal</w:t>
+            </w:r>
+            <w:r>
+              <w:t xml:space="preserve">; else</w:t>
+            </w:r>
+            <w:r>
+              <w:t xml:space="preserve"> </w:t>
+            </w:r>
+            <w:r>
+              <w:rPr>
+                <w:rStyle w:val="VerbatimChar"/>
+              </w:rPr>
+              <w:t xml:space="preserve">Vertical</w:t>
+            </w:r>
+            <w:r>
+              <w:t xml:space="preserve">. The 500 m cut sits inside an almost empty corridor in the distribution — only 20 of 4,604 wells fall between 150 m and 600 m — so the classification is insensitive to it.</w:t>
             </w:r>
             <w:r>
               <w:t xml:space="preserve"> </w:t>
@@ -2338,113 +2325,25 @@
                 <w:b/>
                 <w:bCs/>
               </w:rPr>
-              <w:t xml:space="preserve">[derived]</w:t>
-            </w:r>
-          </w:p>
-        </w:tc>
-        <w:tc>
-          <w:tcPr/>
-          <w:p>
-            <w:pPr>
-              <w:pStyle w:val="Compact"/>
-            </w:pPr>
-            <w:r>
-              <w:rPr>
-                <w:rStyle w:val="VerbatimChar"/>
-              </w:rPr>
-              <w:t xml:space="preserve">max</w:t>
-            </w:r>
-            <w:r>
-              <w:t xml:space="preserve"> </w:t>
-            </w:r>
-            <w:r>
-              <w:t xml:space="preserve">across jobs — a property of the wellbore, so it does not sum</w:t>
-            </w:r>
-          </w:p>
-        </w:tc>
-      </w:tr>
-      <w:tr>
-        <w:tc>
-          <w:tcPr/>
-          <w:p>
-            <w:pPr>
-              <w:pStyle w:val="Compact"/>
-            </w:pPr>
-            <w:r>
-              <w:rPr>
-                <w:rStyle w:val="VerbatimChar"/>
-              </w:rPr>
-              <w:t xml:space="preserve">stages</w:t>
-            </w:r>
-            <w:r>
-              <w:t xml:space="preserve">,</w:t>
-            </w:r>
-            <w:r>
-              <w:t xml:space="preserve"> </w:t>
-            </w:r>
-            <w:r>
-              <w:rPr>
-                <w:rStyle w:val="VerbatimChar"/>
-              </w:rPr>
-              <w:t xml:space="preserve">proppant_t</w:t>
-            </w:r>
-            <w:r>
-              <w:t xml:space="preserve">,</w:t>
-            </w:r>
-            <w:r>
-              <w:t xml:space="preserve"> </w:t>
-            </w:r>
-            <w:r>
-              <w:rPr>
-                <w:rStyle w:val="VerbatimChar"/>
-              </w:rPr>
-              <w:t xml:space="preserve">frac_water_m3</w:t>
-            </w:r>
-            <w:r>
-              <w:t xml:space="preserve"> </w:t>
-            </w:r>
-            <w:r>
-              <w:rPr>
+              <w:t xml:space="preserve">Never imputed.</w:t>
+            </w:r>
+          </w:p>
+        </w:tc>
+      </w:tr>
+      <w:tr>
+        <w:tc>
+          <w:tcPr/>
+          <w:p>
+            <w:pPr>
+              <w:pStyle w:val="Compact"/>
+            </w:pPr>
+            <w:r>
+              <w:rPr>
+                <w:rStyle w:val="VerbatimChar"/>
                 <w:b/>
                 <w:bCs/>
               </w:rPr>
-              <w:t xml:space="preserve">[derived]</w:t>
-            </w:r>
-          </w:p>
-        </w:tc>
-        <w:tc>
-          <w:tcPr/>
-          <w:p>
-            <w:pPr>
-              <w:pStyle w:val="Compact"/>
-            </w:pPr>
-            <w:r>
-              <w:rPr>
-                <w:rStyle w:val="VerbatimChar"/>
-              </w:rPr>
-              <w:t xml:space="preserve">sum</w:t>
-            </w:r>
-            <w:r>
-              <w:t xml:space="preserve"> </w:t>
-            </w:r>
-            <w:r>
-              <w:t xml:space="preserve">across jobs — consumed per job, so they do</w:t>
-            </w:r>
-          </w:p>
-        </w:tc>
-      </w:tr>
-      <w:tr>
-        <w:tc>
-          <w:tcPr/>
-          <w:p>
-            <w:pPr>
-              <w:pStyle w:val="Compact"/>
-            </w:pPr>
-            <w:r>
-              <w:rPr>
-                <w:rStyle w:val="VerbatimChar"/>
-              </w:rPr>
-              <w:t xml:space="preserve">max_pressure_psi</w:t>
+              <w:t xml:space="preserve">name_marker</w:t>
             </w:r>
             <w:r>
               <w:t xml:space="preserve"> </w:t>
@@ -2465,32 +2364,52 @@
               <w:pStyle w:val="Compact"/>
             </w:pPr>
             <w:r>
-              <w:rPr>
-                <w:rStyle w:val="VerbatimChar"/>
-              </w:rPr>
-              <w:t xml:space="preserve">max</w:t>
-            </w:r>
-            <w:r>
-              <w:t xml:space="preserve"> </w:t>
-            </w:r>
-            <w:r>
-              <w:t xml:space="preserve">across jobs — an observed peak</w:t>
-            </w:r>
-          </w:p>
-        </w:tc>
-      </w:tr>
-      <w:tr>
-        <w:tc>
-          <w:tcPr/>
-          <w:p>
-            <w:pPr>
-              <w:pStyle w:val="Compact"/>
-            </w:pPr>
-            <w:r>
-              <w:rPr>
-                <w:rStyle w:val="VerbatimChar"/>
-              </w:rPr>
-              <w:t xml:space="preserve">proppant_kg_per_m</w:t>
+              <w:t xml:space="preserve">From the well name (</w:t>
+            </w:r>
+            <w:r>
+              <w:rPr>
+                <w:rStyle w:val="VerbatimChar"/>
+              </w:rPr>
+              <w:t xml:space="preserve">sigla</w:t>
+            </w:r>
+            <w:r>
+              <w:t xml:space="preserve">), which encodes trajectory by Argentine convention:</w:t>
+            </w:r>
+            <w:r>
+              <w:t xml:space="preserve"> </w:t>
+            </w:r>
+            <w:r>
+              <w:rPr>
+                <w:rStyle w:val="VerbatimChar"/>
+              </w:rPr>
+              <w:t xml:space="preserve">(h) horizontal</w:t>
+            </w:r>
+            <w:r>
+              <w:t xml:space="preserve">,</w:t>
+            </w:r>
+            <w:r>
+              <w:t xml:space="preserve"> </w:t>
+            </w:r>
+            <w:r>
+              <w:rPr>
+                <w:rStyle w:val="VerbatimChar"/>
+              </w:rPr>
+              <w:t xml:space="preserve">(d) directional</w:t>
+            </w:r>
+            <w:r>
+              <w:t xml:space="preserve">,</w:t>
+            </w:r>
+            <w:r>
+              <w:t xml:space="preserve"> </w:t>
+            </w:r>
+            <w:r>
+              <w:rPr>
+                <w:rStyle w:val="VerbatimChar"/>
+              </w:rPr>
+              <w:t xml:space="preserve">Not indicated</w:t>
+            </w:r>
+            <w:r>
+              <w:t xml:space="preserve">. A convention, not a measurement — hence its own column. Over the 4,465 wells with a measured trajectory it is</w:t>
             </w:r>
             <w:r>
               <w:t xml:space="preserve"> </w:t>
@@ -2500,80 +2419,31 @@
                 <w:b/>
                 <w:bCs/>
               </w:rPr>
-              <w:t xml:space="preserve">[derived]</w:t>
-            </w:r>
-          </w:p>
-        </w:tc>
-        <w:tc>
-          <w:tcPr/>
-          <w:p>
-            <w:pPr>
-              <w:pStyle w:val="Compact"/>
-            </w:pPr>
-            <w:r>
-              <w:rPr>
-                <w:rStyle w:val="VerbatimChar"/>
-              </w:rPr>
-              <w:t xml:space="preserve">proppant_t × 1000 / lateral_m</w:t>
-            </w:r>
-            <w:r>
-              <w:t xml:space="preserve">; NULL when lateral is 0</w:t>
-            </w:r>
-          </w:p>
-        </w:tc>
-      </w:tr>
-      <w:tr>
-        <w:tc>
-          <w:tcPr/>
-          <w:p>
-            <w:pPr>
-              <w:pStyle w:val="Compact"/>
-            </w:pPr>
-            <w:r>
-              <w:rPr>
-                <w:rStyle w:val="VerbatimChar"/>
-              </w:rPr>
-              <w:t xml:space="preserve">stage_spacing_m</w:t>
-            </w:r>
-            <w:r>
-              <w:t xml:space="preserve"> </w:t>
-            </w:r>
-            <w:r>
-              <w:rPr>
+              <w:t xml:space="preserve">99.1% sensitive and 97.1% precise</w:t>
+            </w:r>
+            <w:r>
+              <w:t xml:space="preserve"> </w:t>
+            </w:r>
+            <w:r>
+              <w:t xml:space="preserve">for horizontals.</w:t>
+            </w:r>
+          </w:p>
+        </w:tc>
+      </w:tr>
+      <w:tr>
+        <w:tc>
+          <w:tcPr/>
+          <w:p>
+            <w:pPr>
+              <w:pStyle w:val="Compact"/>
+            </w:pPr>
+            <w:r>
+              <w:rPr>
+                <w:rStyle w:val="VerbatimChar"/>
                 <w:b/>
                 <w:bCs/>
               </w:rPr>
-              <w:t xml:space="preserve">[derived]</w:t>
-            </w:r>
-          </w:p>
-        </w:tc>
-        <w:tc>
-          <w:tcPr/>
-          <w:p>
-            <w:pPr>
-              <w:pStyle w:val="Compact"/>
-            </w:pPr>
-            <w:r>
-              <w:rPr>
-                <w:rStyle w:val="VerbatimChar"/>
-              </w:rPr>
-              <w:t xml:space="preserve">lateral_m / stages</w:t>
-            </w:r>
-          </w:p>
-        </w:tc>
-      </w:tr>
-      <w:tr>
-        <w:tc>
-          <w:tcPr/>
-          <w:p>
-            <w:pPr>
-              <w:pStyle w:val="Compact"/>
-            </w:pPr>
-            <w:r>
-              <w:rPr>
-                <w:rStyle w:val="VerbatimChar"/>
-              </w:rPr>
-              <w:t xml:space="preserve">gor_m3_m3</w:t>
+              <w:t xml:space="preserve">trajectory_class</w:t>
             </w:r>
             <w:r>
               <w:t xml:space="preserve"> </w:t>
@@ -2594,32 +2464,7 @@
               <w:pStyle w:val="Compact"/>
             </w:pPr>
             <w:r>
-              <w:rPr>
-                <w:rStyle w:val="VerbatimChar"/>
-              </w:rPr>
-              <w:t xml:space="preserve">cum_gas × 1000 / cum_oil</w:t>
-            </w:r>
-            <w:r>
-              <w:t xml:space="preserve"> </w:t>
-            </w:r>
-            <w:r>
-              <w:t xml:space="preserve">(the ×1000 converts 10³ m³ → m³)</w:t>
-            </w:r>
-          </w:p>
-        </w:tc>
-      </w:tr>
-      <w:tr>
-        <w:tc>
-          <w:tcPr/>
-          <w:p>
-            <w:pPr>
-              <w:pStyle w:val="Compact"/>
-            </w:pPr>
-            <w:r>
-              <w:rPr>
-                <w:rStyle w:val="VerbatimChar"/>
-              </w:rPr>
-              <w:t xml:space="preserve">first_prod_declared</w:t>
+              <w:t xml:space="preserve">The</w:t>
             </w:r>
             <w:r>
               <w:t xml:space="preserve"> </w:t>
@@ -2629,34 +2474,176 @@
                 <w:b/>
                 <w:bCs/>
               </w:rPr>
-              <w:t xml:space="preserve">[derived]</w:t>
-            </w:r>
-          </w:p>
-        </w:tc>
-        <w:tc>
-          <w:tcPr/>
-          <w:p>
-            <w:pPr>
-              <w:pStyle w:val="Compact"/>
-            </w:pPr>
-            <w:r>
-              <w:t xml:space="preserve">first-production month from the official padrón</w:t>
-            </w:r>
-          </w:p>
-        </w:tc>
-      </w:tr>
-      <w:tr>
-        <w:tc>
-          <w:tcPr/>
-          <w:p>
-            <w:pPr>
-              <w:pStyle w:val="Compact"/>
-            </w:pPr>
-            <w:r>
-              <w:rPr>
-                <w:rStyle w:val="VerbatimChar"/>
-              </w:rPr>
-              <w:t xml:space="preserve">first_prod_month</w:t>
+              <w:t xml:space="preserve">best available answer</w:t>
+            </w:r>
+            <w:r>
+              <w:t xml:space="preserve">, combining the two above. Measurement wins wherever it exists; the name speaks only for wells with no fracture record: measured ≥ 500 m →</w:t>
+            </w:r>
+            <w:r>
+              <w:t xml:space="preserve"> </w:t>
+            </w:r>
+            <w:r>
+              <w:rPr>
+                <w:rStyle w:val="VerbatimChar"/>
+              </w:rPr>
+              <w:t xml:space="preserve">Horizontal</w:t>
+            </w:r>
+            <w:r>
+              <w:t xml:space="preserve"> </w:t>
+            </w:r>
+            <w:r>
+              <w:t xml:space="preserve">(2,426); measured short + named</w:t>
+            </w:r>
+            <w:r>
+              <w:t xml:space="preserve"> </w:t>
+            </w:r>
+            <w:r>
+              <w:rPr>
+                <w:rStyle w:val="VerbatimChar"/>
+              </w:rPr>
+              <w:t xml:space="preserve">(d)</w:t>
+            </w:r>
+            <w:r>
+              <w:t xml:space="preserve"> </w:t>
+            </w:r>
+            <w:r>
+              <w:t xml:space="preserve">→</w:t>
+            </w:r>
+            <w:r>
+              <w:t xml:space="preserve"> </w:t>
+            </w:r>
+            <w:r>
+              <w:rPr>
+                <w:rStyle w:val="VerbatimChar"/>
+              </w:rPr>
+              <w:t xml:space="preserve">Directional</w:t>
+            </w:r>
+            <w:r>
+              <w:t xml:space="preserve"> </w:t>
+            </w:r>
+            <w:r>
+              <w:t xml:space="preserve">(925); measured short otherwise →</w:t>
+            </w:r>
+            <w:r>
+              <w:t xml:space="preserve"> </w:t>
+            </w:r>
+            <w:r>
+              <w:rPr>
+                <w:rStyle w:val="VerbatimChar"/>
+              </w:rPr>
+              <w:t xml:space="preserve">Vertical</w:t>
+            </w:r>
+            <w:r>
+              <w:t xml:space="preserve"> </w:t>
+            </w:r>
+            <w:r>
+              <w:t xml:space="preserve">(1,114); no record +</w:t>
+            </w:r>
+            <w:r>
+              <w:t xml:space="preserve"> </w:t>
+            </w:r>
+            <w:r>
+              <w:rPr>
+                <w:rStyle w:val="VerbatimChar"/>
+              </w:rPr>
+              <w:t xml:space="preserve">(h)</w:t>
+            </w:r>
+            <w:r>
+              <w:t xml:space="preserve"> </w:t>
+            </w:r>
+            <w:r>
+              <w:t xml:space="preserve">→</w:t>
+            </w:r>
+            <w:r>
+              <w:t xml:space="preserve"> </w:t>
+            </w:r>
+            <w:r>
+              <w:rPr>
+                <w:rStyle w:val="VerbatimChar"/>
+              </w:rPr>
+              <w:t xml:space="preserve">Horizontal</w:t>
+            </w:r>
+            <w:r>
+              <w:t xml:space="preserve"> </w:t>
+            </w:r>
+            <w:r>
+              <w:t xml:space="preserve">(393); no record +</w:t>
+            </w:r>
+            <w:r>
+              <w:t xml:space="preserve"> </w:t>
+            </w:r>
+            <w:r>
+              <w:rPr>
+                <w:rStyle w:val="VerbatimChar"/>
+              </w:rPr>
+              <w:t xml:space="preserve">(d)</w:t>
+            </w:r>
+            <w:r>
+              <w:t xml:space="preserve"> </w:t>
+            </w:r>
+            <w:r>
+              <w:t xml:space="preserve">→</w:t>
+            </w:r>
+            <w:r>
+              <w:t xml:space="preserve"> </w:t>
+            </w:r>
+            <w:r>
+              <w:rPr>
+                <w:rStyle w:val="VerbatimChar"/>
+              </w:rPr>
+              <w:t xml:space="preserve">Directional</w:t>
+            </w:r>
+            <w:r>
+              <w:t xml:space="preserve"> </w:t>
+            </w:r>
+            <w:r>
+              <w:t xml:space="preserve">(2,656); else</w:t>
+            </w:r>
+            <w:r>
+              <w:t xml:space="preserve"> </w:t>
+            </w:r>
+            <w:r>
+              <w:rPr>
+                <w:rStyle w:val="VerbatimChar"/>
+              </w:rPr>
+              <w:t xml:space="preserve">Unknown</w:t>
+            </w:r>
+            <w:r>
+              <w:t xml:space="preserve"> </w:t>
+            </w:r>
+            <w:r>
+              <w:t xml:space="preserve">(77,903). Note a measured well named</w:t>
+            </w:r>
+            <w:r>
+              <w:t xml:space="preserve"> </w:t>
+            </w:r>
+            <w:r>
+              <w:rPr>
+                <w:rStyle w:val="VerbatimChar"/>
+              </w:rPr>
+              <w:t xml:space="preserve">(h)</w:t>
+            </w:r>
+            <w:r>
+              <w:t xml:space="preserve"> </w:t>
+            </w:r>
+            <w:r>
+              <w:t xml:space="preserve">with a short reported lateral stays with the measurement — lateral length is evidence, a name is a convention.</w:t>
+            </w:r>
+          </w:p>
+        </w:tc>
+      </w:tr>
+      <w:tr>
+        <w:tc>
+          <w:tcPr/>
+          <w:p>
+            <w:pPr>
+              <w:pStyle w:val="Compact"/>
+            </w:pPr>
+            <w:r>
+              <w:rPr>
+                <w:rStyle w:val="VerbatimChar"/>
+              </w:rPr>
+              <w:t xml:space="preserve">lateral_m</w:t>
             </w:r>
             <w:r>
               <w:t xml:space="preserve"> </w:t>
@@ -2677,23 +2664,56 @@
               <w:pStyle w:val="Compact"/>
             </w:pPr>
             <w:r>
-              <w:t xml:space="preserve">first month with non-zero oil or gas in this dataset</w:t>
-            </w:r>
-          </w:p>
-        </w:tc>
-      </w:tr>
-      <w:tr>
-        <w:tc>
-          <w:tcPr/>
-          <w:p>
-            <w:pPr>
-              <w:pStyle w:val="Compact"/>
-            </w:pPr>
-            <w:r>
-              <w:rPr>
-                <w:rStyle w:val="VerbatimChar"/>
-              </w:rPr>
-              <w:t xml:space="preserve">operator_asof</w:t>
+              <w:rPr>
+                <w:rStyle w:val="VerbatimChar"/>
+              </w:rPr>
+              <w:t xml:space="preserve">max</w:t>
+            </w:r>
+            <w:r>
+              <w:t xml:space="preserve"> </w:t>
+            </w:r>
+            <w:r>
+              <w:t xml:space="preserve">across jobs — a property of the wellbore, so it does not sum</w:t>
+            </w:r>
+          </w:p>
+        </w:tc>
+      </w:tr>
+      <w:tr>
+        <w:tc>
+          <w:tcPr/>
+          <w:p>
+            <w:pPr>
+              <w:pStyle w:val="Compact"/>
+            </w:pPr>
+            <w:r>
+              <w:rPr>
+                <w:rStyle w:val="VerbatimChar"/>
+              </w:rPr>
+              <w:t xml:space="preserve">stages</w:t>
+            </w:r>
+            <w:r>
+              <w:t xml:space="preserve">,</w:t>
+            </w:r>
+            <w:r>
+              <w:t xml:space="preserve"> </w:t>
+            </w:r>
+            <w:r>
+              <w:rPr>
+                <w:rStyle w:val="VerbatimChar"/>
+              </w:rPr>
+              <w:t xml:space="preserve">proppant_t</w:t>
+            </w:r>
+            <w:r>
+              <w:t xml:space="preserve">,</w:t>
+            </w:r>
+            <w:r>
+              <w:t xml:space="preserve"> </w:t>
+            </w:r>
+            <w:r>
+              <w:rPr>
+                <w:rStyle w:val="VerbatimChar"/>
+              </w:rPr>
+              <w:t xml:space="preserve">frac_water_m3</w:t>
             </w:r>
             <w:r>
               <w:t xml:space="preserve"> </w:t>
@@ -2714,7 +2734,32 @@
               <w:pStyle w:val="Compact"/>
             </w:pPr>
             <w:r>
-              <w:t xml:space="preserve">operator holding the well</w:t>
+              <w:rPr>
+                <w:rStyle w:val="VerbatimChar"/>
+              </w:rPr>
+              <w:t xml:space="preserve">sum</w:t>
+            </w:r>
+            <w:r>
+              <w:t xml:space="preserve"> </w:t>
+            </w:r>
+            <w:r>
+              <w:t xml:space="preserve">across jobs — consumed per job, so they do</w:t>
+            </w:r>
+          </w:p>
+        </w:tc>
+      </w:tr>
+      <w:tr>
+        <w:tc>
+          <w:tcPr/>
+          <w:p>
+            <w:pPr>
+              <w:pStyle w:val="Compact"/>
+            </w:pPr>
+            <w:r>
+              <w:rPr>
+                <w:rStyle w:val="VerbatimChar"/>
+              </w:rPr>
+              <w:t xml:space="preserve">max_pressure_psi</w:t>
             </w:r>
             <w:r>
               <w:t xml:space="preserve"> </w:t>
@@ -2724,26 +2769,43 @@
                 <w:b/>
                 <w:bCs/>
               </w:rPr>
-              <w:t xml:space="preserve">in that month</w:t>
-            </w:r>
-            <w:r>
-              <w:t xml:space="preserve">, by range join</w:t>
-            </w:r>
-          </w:p>
-        </w:tc>
-      </w:tr>
-      <w:tr>
-        <w:tc>
-          <w:tcPr/>
-          <w:p>
-            <w:pPr>
-              <w:pStyle w:val="Compact"/>
-            </w:pPr>
-            <w:r>
-              <w:rPr>
-                <w:rStyle w:val="VerbatimChar"/>
-              </w:rPr>
-              <w:t xml:space="preserve">well_fluid_asof</w:t>
+              <w:t xml:space="preserve">[derived]</w:t>
+            </w:r>
+          </w:p>
+        </w:tc>
+        <w:tc>
+          <w:tcPr/>
+          <w:p>
+            <w:pPr>
+              <w:pStyle w:val="Compact"/>
+            </w:pPr>
+            <w:r>
+              <w:rPr>
+                <w:rStyle w:val="VerbatimChar"/>
+              </w:rPr>
+              <w:t xml:space="preserve">max</w:t>
+            </w:r>
+            <w:r>
+              <w:t xml:space="preserve"> </w:t>
+            </w:r>
+            <w:r>
+              <w:t xml:space="preserve">across jobs — an observed peak</w:t>
+            </w:r>
+          </w:p>
+        </w:tc>
+      </w:tr>
+      <w:tr>
+        <w:tc>
+          <w:tcPr/>
+          <w:p>
+            <w:pPr>
+              <w:pStyle w:val="Compact"/>
+            </w:pPr>
+            <w:r>
+              <w:rPr>
+                <w:rStyle w:val="VerbatimChar"/>
+              </w:rPr>
+              <w:t xml:space="preserve">proppant_kg_per_m</w:t>
             </w:r>
             <w:r>
               <w:t xml:space="preserve"> </w:t>
@@ -2767,29 +2829,26 @@
               <w:rPr>
                 <w:rStyle w:val="VerbatimChar"/>
               </w:rPr>
-              <w:t xml:space="preserve">tipopozo</w:t>
-            </w:r>
-            <w:r>
-              <w:t xml:space="preserve"> </w:t>
-            </w:r>
-            <w:r>
-              <w:t xml:space="preserve">in force that month, by ASOF join (events record only transitions)</w:t>
-            </w:r>
-          </w:p>
-        </w:tc>
-      </w:tr>
-      <w:tr>
-        <w:tc>
-          <w:tcPr/>
-          <w:p>
-            <w:pPr>
-              <w:pStyle w:val="Compact"/>
-            </w:pPr>
-            <w:r>
-              <w:rPr>
-                <w:rStyle w:val="VerbatimChar"/>
-              </w:rPr>
-              <w:t xml:space="preserve">operator_latest</w:t>
+              <w:t xml:space="preserve">proppant_t × 1000 / lateral_m</w:t>
+            </w:r>
+            <w:r>
+              <w:t xml:space="preserve">; NULL when lateral is 0</w:t>
+            </w:r>
+          </w:p>
+        </w:tc>
+      </w:tr>
+      <w:tr>
+        <w:tc>
+          <w:tcPr/>
+          <w:p>
+            <w:pPr>
+              <w:pStyle w:val="Compact"/>
+            </w:pPr>
+            <w:r>
+              <w:rPr>
+                <w:rStyle w:val="VerbatimChar"/>
+              </w:rPr>
+              <w:t xml:space="preserve">stage_spacing_m</w:t>
             </w:r>
             <w:r>
               <w:t xml:space="preserve"> </w:t>
@@ -2810,41 +2869,26 @@
               <w:pStyle w:val="Compact"/>
             </w:pPr>
             <w:r>
-              <w:t xml:space="preserve">most recent operator — a different question, and a different answer</w:t>
-            </w:r>
-          </w:p>
-        </w:tc>
-      </w:tr>
-      <w:tr>
-        <w:tc>
-          <w:tcPr/>
-          <w:p>
-            <w:pPr>
-              <w:pStyle w:val="Compact"/>
-            </w:pPr>
-            <w:r>
-              <w:rPr>
-                <w:rStyle w:val="VerbatimChar"/>
-              </w:rPr>
-              <w:t xml:space="preserve">tef</w:t>
-            </w:r>
-            <w:r>
-              <w:t xml:space="preserve"> </w:t>
-            </w:r>
-            <w:r>
-              <w:t xml:space="preserve">(in</w:t>
-            </w:r>
-            <w:r>
-              <w:t xml:space="preserve"> </w:t>
-            </w:r>
-            <w:r>
-              <w:rPr>
-                <w:rStyle w:val="VerbatimChar"/>
-              </w:rPr>
-              <w:t xml:space="preserve">prod_monthly</w:t>
-            </w:r>
-            <w:r>
-              <w:t xml:space="preserve">)</w:t>
+              <w:rPr>
+                <w:rStyle w:val="VerbatimChar"/>
+              </w:rPr>
+              <w:t xml:space="preserve">lateral_m / stages</w:t>
+            </w:r>
+          </w:p>
+        </w:tc>
+      </w:tr>
+      <w:tr>
+        <w:tc>
+          <w:tcPr/>
+          <w:p>
+            <w:pPr>
+              <w:pStyle w:val="Compact"/>
+            </w:pPr>
+            <w:r>
+              <w:rPr>
+                <w:rStyle w:val="VerbatimChar"/>
+              </w:rPr>
+              <w:t xml:space="preserve">gor_m3_m3</w:t>
             </w:r>
             <w:r>
               <w:t xml:space="preserve"> </w:t>
@@ -2865,6 +2909,277 @@
               <w:pStyle w:val="Compact"/>
             </w:pPr>
             <w:r>
+              <w:rPr>
+                <w:rStyle w:val="VerbatimChar"/>
+              </w:rPr>
+              <w:t xml:space="preserve">cum_gas × 1000 / cum_oil</w:t>
+            </w:r>
+            <w:r>
+              <w:t xml:space="preserve"> </w:t>
+            </w:r>
+            <w:r>
+              <w:t xml:space="preserve">(the ×1000 converts 10³ m³ → m³)</w:t>
+            </w:r>
+          </w:p>
+        </w:tc>
+      </w:tr>
+      <w:tr>
+        <w:tc>
+          <w:tcPr/>
+          <w:p>
+            <w:pPr>
+              <w:pStyle w:val="Compact"/>
+            </w:pPr>
+            <w:r>
+              <w:rPr>
+                <w:rStyle w:val="VerbatimChar"/>
+              </w:rPr>
+              <w:t xml:space="preserve">first_prod_declared</w:t>
+            </w:r>
+            <w:r>
+              <w:t xml:space="preserve"> </w:t>
+            </w:r>
+            <w:r>
+              <w:rPr>
+                <w:b/>
+                <w:bCs/>
+              </w:rPr>
+              <w:t xml:space="preserve">[derived]</w:t>
+            </w:r>
+          </w:p>
+        </w:tc>
+        <w:tc>
+          <w:tcPr/>
+          <w:p>
+            <w:pPr>
+              <w:pStyle w:val="Compact"/>
+            </w:pPr>
+            <w:r>
+              <w:t xml:space="preserve">first-production month from the official padrón</w:t>
+            </w:r>
+          </w:p>
+        </w:tc>
+      </w:tr>
+      <w:tr>
+        <w:tc>
+          <w:tcPr/>
+          <w:p>
+            <w:pPr>
+              <w:pStyle w:val="Compact"/>
+            </w:pPr>
+            <w:r>
+              <w:rPr>
+                <w:rStyle w:val="VerbatimChar"/>
+              </w:rPr>
+              <w:t xml:space="preserve">first_prod_month</w:t>
+            </w:r>
+            <w:r>
+              <w:t xml:space="preserve"> </w:t>
+            </w:r>
+            <w:r>
+              <w:rPr>
+                <w:b/>
+                <w:bCs/>
+              </w:rPr>
+              <w:t xml:space="preserve">[derived]</w:t>
+            </w:r>
+          </w:p>
+        </w:tc>
+        <w:tc>
+          <w:tcPr/>
+          <w:p>
+            <w:pPr>
+              <w:pStyle w:val="Compact"/>
+            </w:pPr>
+            <w:r>
+              <w:t xml:space="preserve">first month with non-zero oil or gas in this dataset</w:t>
+            </w:r>
+          </w:p>
+        </w:tc>
+      </w:tr>
+      <w:tr>
+        <w:tc>
+          <w:tcPr/>
+          <w:p>
+            <w:pPr>
+              <w:pStyle w:val="Compact"/>
+            </w:pPr>
+            <w:r>
+              <w:rPr>
+                <w:rStyle w:val="VerbatimChar"/>
+              </w:rPr>
+              <w:t xml:space="preserve">operator_asof</w:t>
+            </w:r>
+            <w:r>
+              <w:t xml:space="preserve"> </w:t>
+            </w:r>
+            <w:r>
+              <w:rPr>
+                <w:b/>
+                <w:bCs/>
+              </w:rPr>
+              <w:t xml:space="preserve">[derived]</w:t>
+            </w:r>
+          </w:p>
+        </w:tc>
+        <w:tc>
+          <w:tcPr/>
+          <w:p>
+            <w:pPr>
+              <w:pStyle w:val="Compact"/>
+            </w:pPr>
+            <w:r>
+              <w:t xml:space="preserve">operator holding the well</w:t>
+            </w:r>
+            <w:r>
+              <w:t xml:space="preserve"> </w:t>
+            </w:r>
+            <w:r>
+              <w:rPr>
+                <w:b/>
+                <w:bCs/>
+              </w:rPr>
+              <w:t xml:space="preserve">in that month</w:t>
+            </w:r>
+            <w:r>
+              <w:t xml:space="preserve">, by range join</w:t>
+            </w:r>
+          </w:p>
+        </w:tc>
+      </w:tr>
+      <w:tr>
+        <w:tc>
+          <w:tcPr/>
+          <w:p>
+            <w:pPr>
+              <w:pStyle w:val="Compact"/>
+            </w:pPr>
+            <w:r>
+              <w:rPr>
+                <w:rStyle w:val="VerbatimChar"/>
+              </w:rPr>
+              <w:t xml:space="preserve">well_fluid_asof</w:t>
+            </w:r>
+            <w:r>
+              <w:t xml:space="preserve"> </w:t>
+            </w:r>
+            <w:r>
+              <w:rPr>
+                <w:b/>
+                <w:bCs/>
+              </w:rPr>
+              <w:t xml:space="preserve">[derived]</w:t>
+            </w:r>
+          </w:p>
+        </w:tc>
+        <w:tc>
+          <w:tcPr/>
+          <w:p>
+            <w:pPr>
+              <w:pStyle w:val="Compact"/>
+            </w:pPr>
+            <w:r>
+              <w:rPr>
+                <w:rStyle w:val="VerbatimChar"/>
+              </w:rPr>
+              <w:t xml:space="preserve">tipopozo</w:t>
+            </w:r>
+            <w:r>
+              <w:t xml:space="preserve"> </w:t>
+            </w:r>
+            <w:r>
+              <w:t xml:space="preserve">in force that month, by ASOF join (events record only transitions)</w:t>
+            </w:r>
+          </w:p>
+        </w:tc>
+      </w:tr>
+      <w:tr>
+        <w:tc>
+          <w:tcPr/>
+          <w:p>
+            <w:pPr>
+              <w:pStyle w:val="Compact"/>
+            </w:pPr>
+            <w:r>
+              <w:rPr>
+                <w:rStyle w:val="VerbatimChar"/>
+              </w:rPr>
+              <w:t xml:space="preserve">operator_latest</w:t>
+            </w:r>
+            <w:r>
+              <w:t xml:space="preserve"> </w:t>
+            </w:r>
+            <w:r>
+              <w:rPr>
+                <w:b/>
+                <w:bCs/>
+              </w:rPr>
+              <w:t xml:space="preserve">[derived]</w:t>
+            </w:r>
+          </w:p>
+        </w:tc>
+        <w:tc>
+          <w:tcPr/>
+          <w:p>
+            <w:pPr>
+              <w:pStyle w:val="Compact"/>
+            </w:pPr>
+            <w:r>
+              <w:t xml:space="preserve">most recent operator — a different question, and a different answer</w:t>
+            </w:r>
+          </w:p>
+        </w:tc>
+      </w:tr>
+      <w:tr>
+        <w:tc>
+          <w:tcPr/>
+          <w:p>
+            <w:pPr>
+              <w:pStyle w:val="Compact"/>
+            </w:pPr>
+            <w:r>
+              <w:rPr>
+                <w:rStyle w:val="VerbatimChar"/>
+              </w:rPr>
+              <w:t xml:space="preserve">tef</w:t>
+            </w:r>
+            <w:r>
+              <w:t xml:space="preserve"> </w:t>
+            </w:r>
+            <w:r>
+              <w:t xml:space="preserve">(in</w:t>
+            </w:r>
+            <w:r>
+              <w:t xml:space="preserve"> </w:t>
+            </w:r>
+            <w:r>
+              <w:rPr>
+                <w:rStyle w:val="VerbatimChar"/>
+              </w:rPr>
+              <w:t xml:space="preserve">prod_monthly</w:t>
+            </w:r>
+            <w:r>
+              <w:t xml:space="preserve">)</w:t>
+            </w:r>
+            <w:r>
+              <w:t xml:space="preserve"> </w:t>
+            </w:r>
+            <w:r>
+              <w:rPr>
+                <w:b/>
+                <w:bCs/>
+              </w:rPr>
+              <w:t xml:space="preserve">[derived]</w:t>
+            </w:r>
+          </w:p>
+        </w:tc>
+        <w:tc>
+          <w:tcPr/>
+          <w:p>
+            <w:pPr>
+              <w:pStyle w:val="Compact"/>
+            </w:pPr>
+            <w:r>
               <w:t xml:space="preserve">clamped to the hours available in the month; five source rows exceed it, worst case 3,058 h</w:t>
             </w:r>
           </w:p>
@@ -2872,7 +3187,192 @@
       </w:tr>
     </w:tbl>
     <w:bookmarkEnd w:id="14"/>
-    <w:bookmarkStart w:id="15" w:name="statistical-conventions"/>
+    <w:bookmarkStart w:id="15" w:name="language"/>
+    <w:p>
+      <w:pPr>
+        <w:pStyle w:val="Heading2"/>
+      </w:pPr>
+      <w:r>
+        <w:t xml:space="preserve">Language</w:t>
+      </w:r>
+    </w:p>
+    <w:p>
+      <w:pPr>
+        <w:pStyle w:val="FirstParagraph"/>
+      </w:pPr>
+      <w:r>
+        <w:t xml:space="preserve">Source values are Spanish and</w:t>
+      </w:r>
+      <w:r>
+        <w:t xml:space="preserve"> </w:t>
+      </w:r>
+      <w:r>
+        <w:rPr>
+          <w:b/>
+          <w:bCs/>
+        </w:rPr>
+        <w:t xml:space="preserve">that is what is stored, filtered on, written to</w:t>
+      </w:r>
+      <w:r>
+        <w:rPr>
+          <w:b/>
+          <w:bCs/>
+        </w:rPr>
+        <w:t xml:space="preserve"> </w:t>
+      </w:r>
+      <w:r>
+        <w:rPr>
+          <w:b/>
+          <w:bCs/>
+        </w:rPr>
+        <w:t xml:space="preserve">the URL and written to a CSV export</w:t>
+      </w:r>
+      <w:r>
+        <w:t xml:space="preserve">. The dashboard appends an English gloss for</w:t>
+      </w:r>
+      <w:r>
+        <w:t xml:space="preserve"> </w:t>
+      </w:r>
+      <w:r>
+        <w:t xml:space="preserve">display only —</w:t>
+      </w:r>
+      <w:r>
+        <w:t xml:space="preserve"> </w:t>
+      </w:r>
+      <w:r>
+        <w:rPr>
+          <w:rStyle w:val="VerbatimChar"/>
+        </w:rPr>
+        <w:t xml:space="preserve">NO CONVENCIONAL (Unconventional)</w:t>
+      </w:r>
+      <w:r>
+        <w:t xml:space="preserve">,</w:t>
+      </w:r>
+      <w:r>
+        <w:t xml:space="preserve"> </w:t>
+      </w:r>
+      <w:r>
+        <w:rPr>
+          <w:rStyle w:val="VerbatimChar"/>
+        </w:rPr>
+        <w:t xml:space="preserve">Bombeo Mecánico (Rod pump)</w:t>
+      </w:r>
+      <w:r>
+        <w:t xml:space="preserve"> </w:t>
+      </w:r>
+      <w:r>
+        <w:t xml:space="preserve">—</w:t>
+      </w:r>
+      <w:r>
+        <w:t xml:space="preserve"> </w:t>
+      </w:r>
+      <w:r>
+        <w:t xml:space="preserve">so a figure checked against the publisher still matches. The gloss table is</w:t>
+      </w:r>
+      <w:r>
+        <w:t xml:space="preserve"> </w:t>
+      </w:r>
+      <w:r>
+        <w:rPr>
+          <w:rStyle w:val="VerbatimChar"/>
+        </w:rPr>
+        <w:t xml:space="preserve">site/js/i18n.js</w:t>
+      </w:r>
+      <w:r>
+        <w:t xml:space="preserve">.</w:t>
+      </w:r>
+    </w:p>
+    <w:p>
+      <w:pPr>
+        <w:pStyle w:val="BodyText"/>
+      </w:pPr>
+      <w:r>
+        <w:t xml:space="preserve">Place names are not translated: provinces, fields (</w:t>
+      </w:r>
+      <w:r>
+        <w:rPr>
+          <w:rStyle w:val="VerbatimChar"/>
+        </w:rPr>
+        <w:t xml:space="preserve">yacimiento</w:t>
+      </w:r>
+      <w:r>
+        <w:t xml:space="preserve">) and concessions</w:t>
+      </w:r>
+      <w:r>
+        <w:t xml:space="preserve"> </w:t>
+      </w:r>
+      <w:r>
+        <w:t xml:space="preserve">(</w:t>
+      </w:r>
+      <w:r>
+        <w:rPr>
+          <w:rStyle w:val="VerbatimChar"/>
+        </w:rPr>
+        <w:t xml:space="preserve">area</w:t>
+      </w:r>
+      <w:r>
+        <w:t xml:space="preserve">) are toponyms. Formation codes are paired with the registry's own</w:t>
+      </w:r>
+      <w:r>
+        <w:t xml:space="preserve"> </w:t>
+      </w:r>
+      <w:r>
+        <w:t xml:space="preserve">spelled-out name from</w:t>
+      </w:r>
+      <w:r>
+        <w:t xml:space="preserve"> </w:t>
+      </w:r>
+      <w:r>
+        <w:rPr>
+          <w:rStyle w:val="VerbatimChar"/>
+        </w:rPr>
+        <w:t xml:space="preserve">formacion</w:t>
+      </w:r>
+      <w:r>
+        <w:t xml:space="preserve">, so</w:t>
+      </w:r>
+      <w:r>
+        <w:t xml:space="preserve"> </w:t>
+      </w:r>
+      <w:r>
+        <w:rPr>
+          <w:rStyle w:val="VerbatimChar"/>
+        </w:rPr>
+        <w:t xml:space="preserve">VMUT</w:t>
+      </w:r>
+      <w:r>
+        <w:t xml:space="preserve"> </w:t>
+      </w:r>
+      <w:r>
+        <w:t xml:space="preserve">displays as</w:t>
+      </w:r>
+      <w:r>
+        <w:t xml:space="preserve"> </w:t>
+      </w:r>
+      <w:r>
+        <w:rPr>
+          <w:rStyle w:val="VerbatimChar"/>
+        </w:rPr>
+        <w:t xml:space="preserve">VMUT (Vaca Muerta)</w:t>
+      </w:r>
+      <w:r>
+        <w:t xml:space="preserve">;</w:t>
+      </w:r>
+      <w:r>
+        <w:t xml:space="preserve"> </w:t>
+      </w:r>
+      <w:r>
+        <w:t xml:space="preserve">all 77 codes map 1:1, and the pairs are emitted by the build rather than</w:t>
+      </w:r>
+      <w:r>
+        <w:t xml:space="preserve"> </w:t>
+      </w:r>
+      <w:r>
+        <w:t xml:space="preserve">hand-written.</w:t>
+      </w:r>
+    </w:p>
+    <w:bookmarkEnd w:id="15"/>
+    <w:bookmarkStart w:id="16" w:name="statistical-conventions"/>
     <w:p>
       <w:pPr>
         <w:pStyle w:val="Heading2"/>
@@ -2971,8 +3471,8 @@
         <w:t xml:space="preserve">counts may be summed across categories within a month but never along time.</w:t>
       </w:r>
     </w:p>
-    <w:bookmarkEnd w:id="15"/>
     <w:bookmarkEnd w:id="16"/>
+    <w:bookmarkEnd w:id="17"/>
     <w:sectPr>
       <w:footnotePr>
         <w:numRestart w:val="eachSect"/>

</xml_diff>